<commit_message>
feat(kiet): complete remaining frontend pages, admin previews, QA suite, and sync project plan/report
</commit_message>
<xml_diff>
--- a/BAO_CAO_MO_TA_DU_AN_FOOD_FINDER.docx
+++ b/BAO_CAO_MO_TA_DU_AN_FOOD_FINDER.docx
@@ -6946,7 +6946,7 @@
               <w:rPr>
                 <w:sz w:val="17"/>
               </w:rPr>
-              <w:t>0%</w:t>
+              <w:t>100%</w:t>
             </w:r>
           </w:p>
         </w:tc>
@@ -7112,7 +7112,7 @@
               <w:rPr>
                 <w:sz w:val="17"/>
               </w:rPr>
-              <w:t>0%</w:t>
+              <w:t>100%</w:t>
             </w:r>
           </w:p>
         </w:tc>
@@ -7285,7 +7285,7 @@
               <w:rPr>
                 <w:sz w:val="17"/>
               </w:rPr>
-              <w:t>0%</w:t>
+              <w:t>100%</w:t>
             </w:r>
           </w:p>
         </w:tc>
@@ -7451,7 +7451,7 @@
               <w:rPr>
                 <w:sz w:val="17"/>
               </w:rPr>
-              <w:t>0%</w:t>
+              <w:t>100%</w:t>
             </w:r>
           </w:p>
         </w:tc>
@@ -7624,7 +7624,7 @@
               <w:rPr>
                 <w:sz w:val="17"/>
               </w:rPr>
-              <w:t>0%</w:t>
+              <w:t>100%</w:t>
             </w:r>
           </w:p>
         </w:tc>
@@ -7790,7 +7790,7 @@
               <w:rPr>
                 <w:sz w:val="17"/>
               </w:rPr>
-              <w:t>0%</w:t>
+              <w:t>100%</w:t>
             </w:r>
           </w:p>
         </w:tc>
@@ -7963,7 +7963,7 @@
               <w:rPr>
                 <w:sz w:val="17"/>
               </w:rPr>
-              <w:t>0%</w:t>
+              <w:t>100%</w:t>
             </w:r>
           </w:p>
         </w:tc>
@@ -8129,7 +8129,7 @@
               <w:rPr>
                 <w:sz w:val="17"/>
               </w:rPr>
-              <w:t>0%</w:t>
+              <w:t>100%</w:t>
             </w:r>
           </w:p>
         </w:tc>
@@ -8302,7 +8302,7 @@
               <w:rPr>
                 <w:sz w:val="17"/>
               </w:rPr>
-              <w:t>0%</w:t>
+              <w:t>100%</w:t>
             </w:r>
           </w:p>
         </w:tc>
@@ -8468,7 +8468,7 @@
               <w:rPr>
                 <w:sz w:val="17"/>
               </w:rPr>
-              <w:t>0%</w:t>
+              <w:t>100%</w:t>
             </w:r>
           </w:p>
         </w:tc>
@@ -8641,7 +8641,7 @@
               <w:rPr>
                 <w:sz w:val="17"/>
               </w:rPr>
-              <w:t>0%</w:t>
+              <w:t>100%</w:t>
             </w:r>
           </w:p>
         </w:tc>
@@ -9485,7 +9485,7 @@
               <w:rPr>
                 <w:sz w:val="17"/>
               </w:rPr>
-              <w:t>0%</w:t>
+              <w:t>100%</w:t>
             </w:r>
           </w:p>
         </w:tc>
@@ -9658,7 +9658,7 @@
               <w:rPr>
                 <w:sz w:val="17"/>
               </w:rPr>
-              <w:t>0%</w:t>
+              <w:t>100%</w:t>
             </w:r>
           </w:p>
         </w:tc>
@@ -9824,7 +9824,7 @@
               <w:rPr>
                 <w:sz w:val="17"/>
               </w:rPr>
-              <w:t>0%</w:t>
+              <w:t>100%</w:t>
             </w:r>
           </w:p>
         </w:tc>
@@ -9997,7 +9997,7 @@
               <w:rPr>
                 <w:sz w:val="17"/>
               </w:rPr>
-              <w:t>0%</w:t>
+              <w:t>100%</w:t>
             </w:r>
           </w:p>
         </w:tc>

</xml_diff>